<commit_message>
docs(gdd): add node structure documentation for Skeleton Enemy
</commit_message>
<xml_diff>
--- a/Docs/GDD.docx
+++ b/Docs/GDD.docx
@@ -122,13 +122,8 @@
         <w:t>- **Final Boss Lantai Bawah**: **The Gatewatcher</w:t>
       </w:r>
       <w:r>
-        <w:t xml:space="preserve"> </w:t>
+        <w:t xml:space="preserve"> Of  Souls</w:t>
       </w:r>
-      <w:proofErr w:type="gramStart"/>
-      <w:r>
-        <w:t>Of  Souls</w:t>
-      </w:r>
-      <w:proofErr w:type="gramEnd"/>
       <w:r>
         <w:t>** – entitas bersayap logam dan mata hitam tak bernyawa. Hanya mereka yang mampu bertahan dari hukuman dungeon dapat melihat matanya terbuka.</w:t>
       </w:r>
@@ -571,6 +566,197 @@
     </w:tbl>
     <w:p/>
     <w:p/>
+    <w:p/>
+    <w:p/>
+    <w:p/>
+    <w:p/>
+    <w:p/>
+    <w:p/>
+    <w:p>
+      <w:pPr>
+        <w:pStyle w:val="Heading2"/>
+      </w:pPr>
+      <w:r>
+        <w:lastRenderedPageBreak/>
+        <w:t>🧱 Struktur Node – Skeleton Enemy</w:t>
+      </w:r>
+    </w:p>
+    <w:p>
+      <w:pPr>
+        <w:rPr>
+          <w:rFonts w:ascii="Courier New" w:hAnsi="Courier New"/>
+          <w:sz w:val="20"/>
+        </w:rPr>
+      </w:pPr>
+      <w:r>
+        <w:rPr>
+          <w:rFonts w:ascii="Courier New" w:hAnsi="Courier New"/>
+          <w:sz w:val="20"/>
+        </w:rPr>
+        <w:br/>
+        <w:t xml:space="preserve">Root: </w:t>
+      </w:r>
+    </w:p>
+    <w:p>
+      <w:r>
+        <w:rPr>
+          <w:rFonts w:ascii="Courier New" w:hAnsi="Courier New"/>
+          <w:sz w:val="20"/>
+        </w:rPr>
+        <w:t>CharacterBody2D (Scene: Enemy_Skeleton.tscn)</w:t>
+      </w:r>
+      <w:r>
+        <w:rPr>
+          <w:rFonts w:ascii="Courier New" w:hAnsi="Courier New"/>
+          <w:sz w:val="20"/>
+        </w:rPr>
+        <w:br/>
+        <w:t>├── AnimatedSprite2D</w:t>
+      </w:r>
+      <w:r>
+        <w:rPr>
+          <w:rFonts w:ascii="Courier New" w:hAnsi="Courier New"/>
+          <w:sz w:val="20"/>
+        </w:rPr>
+        <w:br/>
+        <w:t>│   └── Menampilkan animasi idle, jalan, dan serang Skeleton.</w:t>
+      </w:r>
+      <w:r>
+        <w:rPr>
+          <w:rFonts w:ascii="Courier New" w:hAnsi="Courier New"/>
+          <w:sz w:val="20"/>
+        </w:rPr>
+        <w:br/>
+        <w:t>├── CollisionShape2D</w:t>
+      </w:r>
+      <w:r>
+        <w:rPr>
+          <w:rFonts w:ascii="Courier New" w:hAnsi="Courier New"/>
+          <w:sz w:val="20"/>
+        </w:rPr>
+        <w:br/>
+        <w:t>│   └── Collider utama tubuh skeleton untuk deteksi fisik.</w:t>
+      </w:r>
+      <w:r>
+        <w:rPr>
+          <w:rFonts w:ascii="Courier New" w:hAnsi="Courier New"/>
+          <w:sz w:val="20"/>
+        </w:rPr>
+        <w:br/>
+        <w:t>├── DetectionArea (Area2D)</w:t>
+      </w:r>
+      <w:r>
+        <w:rPr>
+          <w:rFonts w:ascii="Courier New" w:hAnsi="Courier New"/>
+          <w:sz w:val="20"/>
+        </w:rPr>
+        <w:br/>
+        <w:t>│   ├── CollisionShape2D</w:t>
+      </w:r>
+      <w:r>
+        <w:rPr>
+          <w:rFonts w:ascii="Courier New" w:hAnsi="Courier New"/>
+          <w:sz w:val="20"/>
+        </w:rPr>
+        <w:br/>
+        <w:t>│   └── Area deteksi untuk mengetahui jika pemain berada di dekatnya.</w:t>
+      </w:r>
+      <w:r>
+        <w:rPr>
+          <w:rFonts w:ascii="Courier New" w:hAnsi="Courier New"/>
+          <w:sz w:val="20"/>
+        </w:rPr>
+        <w:br/>
+        <w:t>├── HitboxArea (Area2D)</w:t>
+      </w:r>
+      <w:r>
+        <w:rPr>
+          <w:rFonts w:ascii="Courier New" w:hAnsi="Courier New"/>
+          <w:sz w:val="20"/>
+        </w:rPr>
+        <w:br/>
+        <w:t>│   ├── CollisionShape2D</w:t>
+      </w:r>
+      <w:r>
+        <w:rPr>
+          <w:rFonts w:ascii="Courier New" w:hAnsi="Courier New"/>
+          <w:sz w:val="20"/>
+        </w:rPr>
+        <w:br/>
+        <w:t>│   └── Digunakan sebagai area serangan. Diaktifkan saat animasi attack.</w:t>
+      </w:r>
+      <w:r>
+        <w:rPr>
+          <w:rFonts w:ascii="Courier New" w:hAnsi="Courier New"/>
+          <w:sz w:val="20"/>
+        </w:rPr>
+        <w:br/>
+        <w:t>├── RayCast2D</w:t>
+      </w:r>
+      <w:r>
+        <w:rPr>
+          <w:rFonts w:ascii="Courier New" w:hAnsi="Courier New"/>
+          <w:sz w:val="20"/>
+        </w:rPr>
+        <w:br/>
+        <w:t>│   └── Untuk mendeteksi lantai atau dinding agar AI tidak jatuh/macet.</w:t>
+      </w:r>
+      <w:r>
+        <w:rPr>
+          <w:rFonts w:ascii="Courier New" w:hAnsi="Courier New"/>
+          <w:sz w:val="20"/>
+        </w:rPr>
+        <w:br/>
+        <w:t>├── Walk_SFX (AudioStreamPlayer2D)</w:t>
+      </w:r>
+      <w:r>
+        <w:rPr>
+          <w:rFonts w:ascii="Courier New" w:hAnsi="Courier New"/>
+          <w:sz w:val="20"/>
+        </w:rPr>
+        <w:br/>
+        <w:t>│   └── Memainkan suara langkah saat bergerak.</w:t>
+      </w:r>
+      <w:r>
+        <w:rPr>
+          <w:rFonts w:ascii="Courier New" w:hAnsi="Courier New"/>
+          <w:sz w:val="20"/>
+        </w:rPr>
+        <w:br/>
+        <w:t>├── Attack_SFX (AudioStreamPlayer2D)</w:t>
+      </w:r>
+      <w:r>
+        <w:rPr>
+          <w:rFonts w:ascii="Courier New" w:hAnsi="Courier New"/>
+          <w:sz w:val="20"/>
+        </w:rPr>
+        <w:br/>
+        <w:t>│   └── Memainkan efek suara saat menyerang.</w:t>
+      </w:r>
+      <w:r>
+        <w:rPr>
+          <w:rFonts w:ascii="Courier New" w:hAnsi="Courier New"/>
+          <w:sz w:val="20"/>
+        </w:rPr>
+        <w:br/>
+        <w:t>└── Timer</w:t>
+      </w:r>
+      <w:r>
+        <w:rPr>
+          <w:rFonts w:ascii="Courier New" w:hAnsi="Courier New"/>
+          <w:sz w:val="20"/>
+        </w:rPr>
+        <w:br/>
+        <w:t xml:space="preserve">    └── Digunakan sebagai cooldown antara serangan.</w:t>
+      </w:r>
+      <w:r>
+        <w:rPr>
+          <w:rFonts w:ascii="Courier New" w:hAnsi="Courier New"/>
+          <w:sz w:val="20"/>
+        </w:rPr>
+        <w:br/>
+      </w:r>
+    </w:p>
     <w:sectPr>
       <w:pgSz w:w="12240" w:h="15840"/>
       <w:pgMar w:top="720" w:right="720" w:bottom="720" w:left="720" w:header="720" w:footer="720" w:gutter="0"/>

</xml_diff>

<commit_message>
docs(gdd): add node structure documentation for enemy_hp
</commit_message>
<xml_diff>
--- a/Docs/GDD.docx
+++ b/Docs/GDD.docx
@@ -122,8 +122,13 @@
         <w:t>- **Final Boss Lantai Bawah**: **The Gatewatcher</w:t>
       </w:r>
       <w:r>
-        <w:t xml:space="preserve"> Of  Souls</w:t>
+        <w:t xml:space="preserve"> </w:t>
       </w:r>
+      <w:proofErr w:type="gramStart"/>
+      <w:r>
+        <w:t>Of  Souls</w:t>
+      </w:r>
+      <w:proofErr w:type="gramEnd"/>
       <w:r>
         <w:t>** – entitas bersayap logam dan mata hitam tak bernyawa. Hanya mereka yang mampu bertahan dari hukuman dungeon dapat melihat matanya terbuka.</w:t>
       </w:r>
@@ -573,11 +578,189 @@
     <w:p/>
     <w:p/>
     <w:p>
+      <w:r>
+        <w:lastRenderedPageBreak/>
+        <w:br/>
+      </w:r>
+      <w:r>
+        <w:br/>
+      </w:r>
+      <w:r>
+        <w:t>🩸 Struktur Node – Enemy Health Bar</w:t>
+      </w:r>
+    </w:p>
+    <w:p>
+      <w:r>
+        <w:t>Control (EnemyHP)</w:t>
+      </w:r>
+      <w:r>
+        <w:br/>
+      </w:r>
+      <w:r>
+        <w:rPr>
+          <w:rFonts w:ascii="Courier New" w:hAnsi="Courier New"/>
+          <w:sz w:val="20"/>
+        </w:rPr>
+        <w:t>├──</w:t>
+      </w:r>
+      <w:r>
+        <w:t xml:space="preserve"> Bar (TextureProgressBar)</w:t>
+      </w:r>
+      <w:r>
+        <w:br/>
+      </w:r>
+      <w:r>
+        <w:rPr>
+          <w:rFonts w:ascii="Courier New" w:hAnsi="Courier New"/>
+          <w:sz w:val="20"/>
+        </w:rPr>
+        <w:t>│</w:t>
+      </w:r>
+      <w:r>
+        <w:t xml:space="preserve">   </w:t>
+      </w:r>
+      <w:r>
+        <w:t xml:space="preserve">   </w:t>
+      </w:r>
+      <w:r>
+        <w:rPr>
+          <w:rFonts w:ascii="Courier New" w:hAnsi="Courier New"/>
+          <w:sz w:val="20"/>
+        </w:rPr>
+        <w:t>└──</w:t>
+      </w:r>
+      <w:r>
+        <w:t>Background statis untuk health bar (under).</w:t>
+      </w:r>
+      <w:r>
+        <w:br/>
+      </w:r>
+      <w:r>
+        <w:rPr>
+          <w:rFonts w:ascii="Courier New" w:hAnsi="Courier New"/>
+          <w:sz w:val="20"/>
+        </w:rPr>
+        <w:t>├──</w:t>
+      </w:r>
+      <w:r>
+        <w:t>HealthBar (TextureProgressBar)</w:t>
+      </w:r>
+      <w:r>
+        <w:br/>
+      </w:r>
+      <w:r>
+        <w:rPr>
+          <w:rFonts w:ascii="Courier New" w:hAnsi="Courier New"/>
+          <w:sz w:val="20"/>
+        </w:rPr>
+        <w:t>│</w:t>
+      </w:r>
+      <w:r>
+        <w:t xml:space="preserve">  </w:t>
+      </w:r>
+      <w:r>
+        <w:t xml:space="preserve">   </w:t>
+      </w:r>
+      <w:r>
+        <w:rPr>
+          <w:rFonts w:ascii="Courier New" w:hAnsi="Courier New"/>
+          <w:sz w:val="20"/>
+        </w:rPr>
+        <w:t>└──</w:t>
+      </w:r>
+      <w:r>
+        <w:t>Menampilkan nilai HP aktif (foreground).</w:t>
+      </w:r>
+      <w:r>
+        <w:br/>
+      </w:r>
+      <w:r>
+        <w:rPr>
+          <w:rFonts w:ascii="Courier New" w:hAnsi="Courier New"/>
+          <w:sz w:val="20"/>
+        </w:rPr>
+        <w:t>├──</w:t>
+      </w:r>
+      <w:r>
+        <w:t>DamageBar (TextureProgressBar)</w:t>
+      </w:r>
+      <w:r>
+        <w:br/>
+      </w:r>
+      <w:r>
+        <w:rPr>
+          <w:rFonts w:ascii="Courier New" w:hAnsi="Courier New"/>
+          <w:sz w:val="20"/>
+        </w:rPr>
+        <w:t>│</w:t>
+      </w:r>
+      <w:r>
+        <w:t xml:space="preserve">  </w:t>
+      </w:r>
+      <w:r>
+        <w:t xml:space="preserve">   </w:t>
+      </w:r>
+      <w:r>
+        <w:rPr>
+          <w:rFonts w:ascii="Courier New" w:hAnsi="Courier New"/>
+          <w:sz w:val="20"/>
+        </w:rPr>
+        <w:t>└──</w:t>
+      </w:r>
+      <w:r>
+        <w:t>Efek delay HP turun (damage effect).</w:t>
+      </w:r>
+      <w:r>
+        <w:br/>
+      </w:r>
+      <w:r>
+        <w:rPr>
+          <w:rFonts w:ascii="Courier New" w:hAnsi="Courier New"/>
+          <w:sz w:val="20"/>
+        </w:rPr>
+        <w:t>└──</w:t>
+      </w:r>
+      <w:r>
+        <w:t>Timer</w:t>
+      </w:r>
+      <w:r>
+        <w:br/>
+        <w:t xml:space="preserve">    </w:t>
+      </w:r>
+      <w:r>
+        <w:t xml:space="preserve">    </w:t>
+      </w:r>
+      <w:r>
+        <w:rPr>
+          <w:rFonts w:ascii="Courier New" w:hAnsi="Courier New"/>
+          <w:sz w:val="20"/>
+        </w:rPr>
+        <w:t>└──</w:t>
+      </w:r>
+      <w:r>
+        <w:t>Timer untuk animasi delay dari DamageBar.</w:t>
+      </w:r>
+      <w:r>
+        <w:br/>
+      </w:r>
+      <w:r>
+        <w:br/>
+        <w:t>Catatan:</w:t>
+      </w:r>
+      <w:r>
+        <w:br/>
+        <w:t>- Control ini adalah child dari Skeleton (CharacterBody2D).</w:t>
+      </w:r>
+      <w:r>
+        <w:br/>
+        <w:t>- Secara default, node ini disembunyikan (`visible = false`) dan hanya tampil saat enemy terkena damage pertama kali.</w:t>
+      </w:r>
+    </w:p>
+    <w:p>
       <w:pPr>
         <w:pStyle w:val="Heading2"/>
       </w:pPr>
       <w:r>
-        <w:lastRenderedPageBreak/>
         <w:t>🧱 Struktur Node – Skeleton Enemy</w:t>
       </w:r>
     </w:p>

</xml_diff>